<commit_message>
Update final submission doc
</commit_message>
<xml_diff>
--- a/docs/task/Biggy-Submission.docx
+++ b/docs/task/Biggy-Submission.docx
@@ -17,7 +17,27 @@
           <w:sz w:val="38"/>
           <w:szCs w:val="38"/>
         </w:rPr>
-        <w:t>Biggy — Submission Write-Up</w:t>
+        <w:t xml:space="preserve">Biggy </w:t>
+      </w:r>
+      <w:r>
+        <w:rPr>
+          <w:b/>
+          <w:bCs/>
+          <w:color w:val="1F3864"/>
+          <w:sz w:val="38"/>
+          <w:szCs w:val="38"/>
+        </w:rPr>
+        <w:t>-</w:t>
+      </w:r>
+      <w:r>
+        <w:rPr>
+          <w:b/>
+          <w:bCs/>
+          <w:color w:val="1F3864"/>
+          <w:sz w:val="38"/>
+          <w:szCs w:val="38"/>
+        </w:rPr>
+        <w:t xml:space="preserve"> Submission Write-Up</w:t>
       </w:r>
     </w:p>
     <w:p>
@@ -51,16 +71,7 @@
         <w:spacing w:after="140"/>
       </w:pPr>
       <w:r>
-        <w:t>The goal is to earn</w:t>
-      </w:r>
-      <w:r>
-        <w:t xml:space="preserve"> an engineer’s trust </w:t>
-      </w:r>
-      <w:r>
-        <w:t xml:space="preserve">by </w:t>
-      </w:r>
-      <w:r>
-        <w:t>making every claim traceable and machine-verifiable (</w:t>
+        <w:t>The goal is to earn an engineer’s trust by making every claim traceable and machine-verifiable (</w:t>
       </w:r>
       <w:r>
         <w:t>grounding</w:t>
@@ -147,10 +158,23 @@
         <w:spacing w:after="140"/>
       </w:pPr>
       <w:r>
-        <w:t xml:space="preserve">The rest of the stack is plain-Python orchestration, LangChain, </w:t>
-      </w:r>
-      <w:r>
-        <w:t>Pydantic schemas at every LLM boundary, and versioned prompt files</w:t>
+        <w:t xml:space="preserve">The rest of the stack is plain-Python orchestration, </w:t>
+      </w:r>
+      <w:proofErr w:type="spellStart"/>
+      <w:r>
+        <w:t>LangChain</w:t>
+      </w:r>
+      <w:proofErr w:type="spellEnd"/>
+      <w:r>
+        <w:t xml:space="preserve">, </w:t>
+      </w:r>
+      <w:proofErr w:type="spellStart"/>
+      <w:r>
+        <w:t>Pydantic</w:t>
+      </w:r>
+      <w:proofErr w:type="spellEnd"/>
+      <w:r>
+        <w:t xml:space="preserve"> schemas at every LLM boundary, and versioned prompt files</w:t>
       </w:r>
       <w:r>
         <w:t xml:space="preserve">. </w:t>
@@ -159,11 +183,16 @@
         <w:t xml:space="preserve">Failure handling is </w:t>
       </w:r>
       <w:r>
-        <w:t>built in</w:t>
+        <w:t xml:space="preserve">built </w:t>
+      </w:r>
+      <w:proofErr w:type="gramStart"/>
+      <w:r>
+        <w:t>in</w:t>
       </w:r>
       <w:r>
         <w:t>:</w:t>
       </w:r>
+      <w:proofErr w:type="gramEnd"/>
       <w:r>
         <w:t xml:space="preserve"> exponential </w:t>
       </w:r>
@@ -191,7 +220,15 @@
         <w:t xml:space="preserve">wrapped </w:t>
       </w:r>
       <w:r>
-        <w:t xml:space="preserve">into a NextJS web app (with a </w:t>
+        <w:t xml:space="preserve">into a </w:t>
+      </w:r>
+      <w:proofErr w:type="spellStart"/>
+      <w:r>
+        <w:t>NextJS</w:t>
+      </w:r>
+      <w:proofErr w:type="spellEnd"/>
+      <w:r>
+        <w:t xml:space="preserve"> web app (with a </w:t>
       </w:r>
       <w:r>
         <w:t xml:space="preserve">python </w:t>
@@ -333,7 +370,25 @@
         <w:t>wrong</w:t>
       </w:r>
       <w:r>
-        <w:t>. Where a free-form ReAct agent rationalizes its first guess, here a hypothesis only survives if it was attacked and held.</w:t>
+        <w:t xml:space="preserve">. Where a </w:t>
+      </w:r>
+      <w:proofErr w:type="gramStart"/>
+      <w:r>
+        <w:t>free-form</w:t>
+      </w:r>
+      <w:proofErr w:type="gramEnd"/>
+      <w:r>
+        <w:t xml:space="preserve"> </w:t>
+      </w:r>
+      <w:proofErr w:type="spellStart"/>
+      <w:proofErr w:type="gramStart"/>
+      <w:r>
+        <w:t>ReAct</w:t>
+      </w:r>
+      <w:proofErr w:type="spellEnd"/>
+      <w:proofErr w:type="gramEnd"/>
+      <w:r>
+        <w:t xml:space="preserve"> agent rationalizes its first guess, here a hypothesis only survives if it was attacked and held.</w:t>
       </w:r>
     </w:p>
     <w:p>
@@ -390,7 +445,15 @@
         <w:t xml:space="preserve">Gemini </w:t>
       </w:r>
       <w:r>
-        <w:t>pro-tier model over-commit to a single cause instead of holding the ~50/50 split. So calibration is real but partial</w:t>
+        <w:t xml:space="preserve">pro-tier model over-commit to a single cause instead of holding the ~50/50 split. </w:t>
+      </w:r>
+      <w:proofErr w:type="gramStart"/>
+      <w:r>
+        <w:t>So</w:t>
+      </w:r>
+      <w:proofErr w:type="gramEnd"/>
+      <w:r>
+        <w:t xml:space="preserve"> calibration is real but partial</w:t>
       </w:r>
       <w:r>
         <w:t xml:space="preserve"> – this requires further work</w:t>
@@ -449,7 +512,15 @@
         <w:t>Reconcile:</w:t>
       </w:r>
       <w:r>
-        <w:t xml:space="preserve"> A final no-LLM pass flags the public status draft when it still blames a cause the evidence doesn’t support, and summarizes customer impact from in-window tickets.</w:t>
+        <w:t xml:space="preserve"> A final no-LLM pass flags the public status draft when it still blames a cause the evidence doesn’t </w:t>
+      </w:r>
+      <w:proofErr w:type="gramStart"/>
+      <w:r>
+        <w:t>support, and</w:t>
+      </w:r>
+      <w:proofErr w:type="gramEnd"/>
+      <w:r>
+        <w:t xml:space="preserve"> summarizes customer impact from in-window tickets.</w:t>
       </w:r>
     </w:p>
     <w:p>
@@ -485,12 +556,16 @@
       <w:r>
         <w:t xml:space="preserve">. Every result carries the </w:t>
       </w:r>
+      <w:proofErr w:type="spellStart"/>
+      <w:proofErr w:type="gramStart"/>
       <w:r>
         <w:rPr>
           <w:rFonts w:ascii="Consolas" w:eastAsia="Consolas" w:hAnsi="Consolas" w:cs="Consolas"/>
         </w:rPr>
         <w:t>path:line</w:t>
       </w:r>
+      <w:proofErr w:type="spellEnd"/>
+      <w:proofErr w:type="gramEnd"/>
       <w:r>
         <w:t xml:space="preserve"> it came from, so a citation can only point at evidence </w:t>
       </w:r>
@@ -500,39 +575,47 @@
       <w:r>
         <w:t>. Structured accessors (</w:t>
       </w:r>
+      <w:proofErr w:type="spellStart"/>
       <w:r>
         <w:rPr>
           <w:rFonts w:ascii="Consolas" w:eastAsia="Consolas" w:hAnsi="Consolas" w:cs="Consolas"/>
         </w:rPr>
         <w:t>get_topology</w:t>
       </w:r>
+      <w:proofErr w:type="spellEnd"/>
       <w:r>
         <w:t xml:space="preserve">, </w:t>
       </w:r>
+      <w:proofErr w:type="spellStart"/>
       <w:r>
         <w:rPr>
           <w:rFonts w:ascii="Consolas" w:eastAsia="Consolas" w:hAnsi="Consolas" w:cs="Consolas"/>
         </w:rPr>
         <w:t>get_changes</w:t>
       </w:r>
+      <w:proofErr w:type="spellEnd"/>
       <w:r>
         <w:t xml:space="preserve">, </w:t>
       </w:r>
+      <w:proofErr w:type="spellStart"/>
       <w:r>
         <w:rPr>
           <w:rFonts w:ascii="Consolas" w:eastAsia="Consolas" w:hAnsi="Consolas" w:cs="Consolas"/>
         </w:rPr>
         <w:t>get_metric</w:t>
       </w:r>
+      <w:proofErr w:type="spellEnd"/>
       <w:r>
         <w:t>) parse data into clean facts; raw tools (</w:t>
       </w:r>
+      <w:proofErr w:type="spellStart"/>
       <w:r>
         <w:rPr>
           <w:rFonts w:ascii="Consolas" w:eastAsia="Consolas" w:hAnsi="Consolas" w:cs="Consolas"/>
         </w:rPr>
         <w:t>read_file</w:t>
       </w:r>
+      <w:proofErr w:type="spellEnd"/>
       <w:r>
         <w:t xml:space="preserve">, </w:t>
       </w:r>
@@ -568,12 +651,6 @@
         <w:gridCol w:w="6760"/>
       </w:tblGrid>
       <w:tr>
-        <w:tblPrEx>
-          <w:tblCellMar>
-            <w:top w:w="0" w:type="dxa"/>
-            <w:bottom w:w="0" w:type="dxa"/>
-          </w:tblCellMar>
-        </w:tblPrEx>
         <w:trPr>
           <w:tblHeader/>
         </w:trPr>
@@ -639,12 +716,6 @@
         </w:tc>
       </w:tr>
       <w:tr>
-        <w:tblPrEx>
-          <w:tblCellMar>
-            <w:top w:w="0" w:type="dxa"/>
-            <w:bottom w:w="0" w:type="dxa"/>
-          </w:tblCellMar>
-        </w:tblPrEx>
         <w:tc>
           <w:tcPr>
             <w:tcW w:w="2600" w:type="dxa"/>
@@ -662,13 +733,41 @@
             </w:tcMar>
           </w:tcPr>
           <w:p>
+            <w:proofErr w:type="spellStart"/>
             <w:r>
               <w:rPr>
                 <w:rFonts w:ascii="Consolas" w:eastAsia="Consolas" w:hAnsi="Consolas" w:cs="Consolas"/>
                 <w:sz w:val="20"/>
                 <w:szCs w:val="20"/>
               </w:rPr>
-              <w:t>list_evidence()</w:t>
+              <w:t>list_</w:t>
+            </w:r>
+            <w:proofErr w:type="gramStart"/>
+            <w:r>
+              <w:rPr>
+                <w:rFonts w:ascii="Consolas" w:eastAsia="Consolas" w:hAnsi="Consolas" w:cs="Consolas"/>
+                <w:sz w:val="20"/>
+                <w:szCs w:val="20"/>
+              </w:rPr>
+              <w:t>evidence</w:t>
+            </w:r>
+            <w:proofErr w:type="spellEnd"/>
+            <w:r>
+              <w:rPr>
+                <w:rFonts w:ascii="Consolas" w:eastAsia="Consolas" w:hAnsi="Consolas" w:cs="Consolas"/>
+                <w:sz w:val="20"/>
+                <w:szCs w:val="20"/>
+              </w:rPr>
+              <w:t>(</w:t>
+            </w:r>
+            <w:proofErr w:type="gramEnd"/>
+            <w:r>
+              <w:rPr>
+                <w:rFonts w:ascii="Consolas" w:eastAsia="Consolas" w:hAnsi="Consolas" w:cs="Consolas"/>
+                <w:sz w:val="20"/>
+                <w:szCs w:val="20"/>
+              </w:rPr>
+              <w:t>)</w:t>
             </w:r>
           </w:p>
         </w:tc>
@@ -694,18 +793,26 @@
                 <w:sz w:val="20"/>
                 <w:szCs w:val="20"/>
               </w:rPr>
-              <w:t>the manifest — what evidence exists and the time ranges it covers</w:t>
+              <w:t xml:space="preserve">the manifest </w:t>
+            </w:r>
+            <w:r>
+              <w:rPr>
+                <w:sz w:val="20"/>
+                <w:szCs w:val="20"/>
+              </w:rPr>
+              <w:t>-</w:t>
+            </w:r>
+            <w:r>
+              <w:rPr>
+                <w:sz w:val="20"/>
+                <w:szCs w:val="20"/>
+              </w:rPr>
+              <w:t xml:space="preserve"> what evidence exists and the time ranges it covers</w:t>
             </w:r>
           </w:p>
         </w:tc>
       </w:tr>
       <w:tr>
-        <w:tblPrEx>
-          <w:tblCellMar>
-            <w:top w:w="0" w:type="dxa"/>
-            <w:bottom w:w="0" w:type="dxa"/>
-          </w:tblCellMar>
-        </w:tblPrEx>
         <w:tc>
           <w:tcPr>
             <w:tcW w:w="2600" w:type="dxa"/>
@@ -724,13 +831,23 @@
             </w:tcMar>
           </w:tcPr>
           <w:p>
+            <w:proofErr w:type="spellStart"/>
             <w:r>
               <w:rPr>
                 <w:rFonts w:ascii="Consolas" w:eastAsia="Consolas" w:hAnsi="Consolas" w:cs="Consolas"/>
                 <w:sz w:val="20"/>
                 <w:szCs w:val="20"/>
               </w:rPr>
-              <w:t>read_file(path)</w:t>
+              <w:t>read_file</w:t>
+            </w:r>
+            <w:proofErr w:type="spellEnd"/>
+            <w:r>
+              <w:rPr>
+                <w:rFonts w:ascii="Consolas" w:eastAsia="Consolas" w:hAnsi="Consolas" w:cs="Consolas"/>
+                <w:sz w:val="20"/>
+                <w:szCs w:val="20"/>
+              </w:rPr>
+              <w:t>(path)</w:t>
             </w:r>
           </w:p>
         </w:tc>
@@ -763,12 +880,6 @@
         </w:tc>
       </w:tr>
       <w:tr>
-        <w:tblPrEx>
-          <w:tblCellMar>
-            <w:top w:w="0" w:type="dxa"/>
-            <w:bottom w:w="0" w:type="dxa"/>
-          </w:tblCellMar>
-        </w:tblPrEx>
         <w:tc>
           <w:tcPr>
             <w:tcW w:w="2600" w:type="dxa"/>
@@ -820,24 +931,30 @@
               </w:rPr>
               <w:t xml:space="preserve">keyword hits across in-window evidence, as </w:t>
             </w:r>
+            <w:proofErr w:type="spellStart"/>
+            <w:proofErr w:type="gramStart"/>
             <w:r>
               <w:rPr>
                 <w:rFonts w:ascii="Consolas" w:eastAsia="Consolas" w:hAnsi="Consolas" w:cs="Consolas"/>
                 <w:sz w:val="20"/>
                 <w:szCs w:val="20"/>
               </w:rPr>
-              <w:t>path:line: text</w:t>
+              <w:t>path:line</w:t>
+            </w:r>
+            <w:proofErr w:type="spellEnd"/>
+            <w:proofErr w:type="gramEnd"/>
+            <w:r>
+              <w:rPr>
+                <w:rFonts w:ascii="Consolas" w:eastAsia="Consolas" w:hAnsi="Consolas" w:cs="Consolas"/>
+                <w:sz w:val="20"/>
+                <w:szCs w:val="20"/>
+              </w:rPr>
+              <w:t>: text</w:t>
             </w:r>
           </w:p>
         </w:tc>
       </w:tr>
       <w:tr>
-        <w:tblPrEx>
-          <w:tblCellMar>
-            <w:top w:w="0" w:type="dxa"/>
-            <w:bottom w:w="0" w:type="dxa"/>
-          </w:tblCellMar>
-        </w:tblPrEx>
         <w:tc>
           <w:tcPr>
             <w:tcW w:w="2600" w:type="dxa"/>
@@ -856,13 +973,23 @@
             </w:tcMar>
           </w:tcPr>
           <w:p>
+            <w:proofErr w:type="spellStart"/>
             <w:r>
               <w:rPr>
                 <w:rFonts w:ascii="Consolas" w:eastAsia="Consolas" w:hAnsi="Consolas" w:cs="Consolas"/>
                 <w:sz w:val="20"/>
                 <w:szCs w:val="20"/>
               </w:rPr>
-              <w:t>get_topology(service)</w:t>
+              <w:t>get_topology</w:t>
+            </w:r>
+            <w:proofErr w:type="spellEnd"/>
+            <w:r>
+              <w:rPr>
+                <w:rFonts w:ascii="Consolas" w:eastAsia="Consolas" w:hAnsi="Consolas" w:cs="Consolas"/>
+                <w:sz w:val="20"/>
+                <w:szCs w:val="20"/>
+              </w:rPr>
+              <w:t>(service)</w:t>
             </w:r>
           </w:p>
         </w:tc>
@@ -889,8 +1016,25 @@
                 <w:sz w:val="20"/>
                 <w:szCs w:val="20"/>
               </w:rPr>
-              <w:t xml:space="preserve">a service’s upstream </w:t>
-            </w:r>
+              <w:t xml:space="preserve">a </w:t>
+            </w:r>
+            <w:proofErr w:type="gramStart"/>
+            <w:r>
+              <w:rPr>
+                <w:sz w:val="20"/>
+                <w:szCs w:val="20"/>
+              </w:rPr>
+              <w:t>service’s</w:t>
+            </w:r>
+            <w:proofErr w:type="gramEnd"/>
+            <w:r>
+              <w:rPr>
+                <w:sz w:val="20"/>
+                <w:szCs w:val="20"/>
+              </w:rPr>
+              <w:t xml:space="preserve"> upstream </w:t>
+            </w:r>
+            <w:proofErr w:type="spellStart"/>
             <w:r>
               <w:rPr>
                 <w:rFonts w:ascii="Consolas" w:eastAsia="Consolas" w:hAnsi="Consolas" w:cs="Consolas"/>
@@ -899,6 +1043,7 @@
               </w:rPr>
               <w:t>depends_on</w:t>
             </w:r>
+            <w:proofErr w:type="spellEnd"/>
             <w:r>
               <w:rPr>
                 <w:sz w:val="20"/>
@@ -910,12 +1055,6 @@
         </w:tc>
       </w:tr>
       <w:tr>
-        <w:tblPrEx>
-          <w:tblCellMar>
-            <w:top w:w="0" w:type="dxa"/>
-            <w:bottom w:w="0" w:type="dxa"/>
-          </w:tblCellMar>
-        </w:tblPrEx>
         <w:tc>
           <w:tcPr>
             <w:tcW w:w="2600" w:type="dxa"/>
@@ -933,13 +1072,23 @@
             </w:tcMar>
           </w:tcPr>
           <w:p>
+            <w:proofErr w:type="spellStart"/>
             <w:r>
               <w:rPr>
                 <w:rFonts w:ascii="Consolas" w:eastAsia="Consolas" w:hAnsi="Consolas" w:cs="Consolas"/>
                 <w:sz w:val="20"/>
                 <w:szCs w:val="20"/>
               </w:rPr>
-              <w:t>get_changes(service?)</w:t>
+              <w:t>get_changes</w:t>
+            </w:r>
+            <w:proofErr w:type="spellEnd"/>
+            <w:r>
+              <w:rPr>
+                <w:rFonts w:ascii="Consolas" w:eastAsia="Consolas" w:hAnsi="Consolas" w:cs="Consolas"/>
+                <w:sz w:val="20"/>
+                <w:szCs w:val="20"/>
+              </w:rPr>
+              <w:t>(service?)</w:t>
             </w:r>
           </w:p>
         </w:tc>
@@ -971,12 +1120,6 @@
         </w:tc>
       </w:tr>
       <w:tr>
-        <w:tblPrEx>
-          <w:tblCellMar>
-            <w:top w:w="0" w:type="dxa"/>
-            <w:bottom w:w="0" w:type="dxa"/>
-          </w:tblCellMar>
-        </w:tblPrEx>
         <w:tc>
           <w:tcPr>
             <w:tcW w:w="2600" w:type="dxa"/>
@@ -995,13 +1138,23 @@
             </w:tcMar>
           </w:tcPr>
           <w:p>
+            <w:proofErr w:type="spellStart"/>
             <w:r>
               <w:rPr>
                 <w:rFonts w:ascii="Consolas" w:eastAsia="Consolas" w:hAnsi="Consolas" w:cs="Consolas"/>
                 <w:sz w:val="20"/>
                 <w:szCs w:val="20"/>
               </w:rPr>
-              <w:t>get_metric(name)</w:t>
+              <w:t>get_metric</w:t>
+            </w:r>
+            <w:proofErr w:type="spellEnd"/>
+            <w:r>
+              <w:rPr>
+                <w:rFonts w:ascii="Consolas" w:eastAsia="Consolas" w:hAnsi="Consolas" w:cs="Consolas"/>
+                <w:sz w:val="20"/>
+                <w:szCs w:val="20"/>
+              </w:rPr>
+              <w:t>(name)</w:t>
             </w:r>
           </w:p>
         </w:tc>
@@ -1051,10 +1204,7 @@
         <w:t xml:space="preserve">There is </w:t>
       </w:r>
       <w:r>
-        <w:t xml:space="preserve">no </w:t>
-      </w:r>
-      <w:r>
-        <w:t xml:space="preserve">embedding RAG </w:t>
+        <w:t xml:space="preserve">no embedding RAG </w:t>
       </w:r>
       <w:r>
         <w:rPr>
@@ -1064,13 +1214,15 @@
         <w:t>inside</w:t>
       </w:r>
       <w:r>
-        <w:t xml:space="preserve"> a run </w:t>
-      </w:r>
-      <w:r>
-        <w:t xml:space="preserve">- </w:t>
-      </w:r>
-      <w:r>
-        <w:t>retrieval is these source-attached tools, and the only graphs are lightweight (in-memory topology + the ledger’s hypothesis↔evidence structure). Semantic/vector cross-incident recall exists in the corpus but is a deferred follow-up.</w:t>
+        <w:t xml:space="preserve"> a run - retrieval is these source-attached tools, and the only graphs are lightweight (in-memory topology + the ledger’s </w:t>
+      </w:r>
+      <w:proofErr w:type="spellStart"/>
+      <w:r>
+        <w:t>hypothesis↔evidence</w:t>
+      </w:r>
+      <w:proofErr w:type="spellEnd"/>
+      <w:r>
+        <w:t xml:space="preserve"> structure). Semantic/vector cross-incident recall exists in the corpus but is a deferred follow-up.</w:t>
       </w:r>
     </w:p>
     <w:p>
@@ -1144,7 +1296,19 @@
         <w:t>Synthetic world first.</w:t>
       </w:r>
       <w:r>
-        <w:t xml:space="preserve"> A time-indexed ~20-service e-commerce corpus — standing knowledge (topology, runbooks, ADRs, ~10 post-mortems), windowed telemetry, and messy human signal — across seven scenario seeds, each clamped to its incident window so the agent can’t read the future. </w:t>
+        <w:t xml:space="preserve"> A time-indexed ~20-service e-commerce corpus </w:t>
+      </w:r>
+      <w:r>
+        <w:t>-</w:t>
+      </w:r>
+      <w:r>
+        <w:t xml:space="preserve"> standing knowledge (topology, runbooks, ADRs, ~10 post-mortems), windowed telemetry, and messy human signal </w:t>
+      </w:r>
+      <w:r>
+        <w:t>-</w:t>
+      </w:r>
+      <w:r>
+        <w:t xml:space="preserve"> across seven scenario seeds, each clamped to its incident window so the agent can’t read the future. </w:t>
       </w:r>
     </w:p>
     <w:p>
@@ -1164,7 +1328,13 @@
         <w:t>CLI-First Scaffold:</w:t>
       </w:r>
       <w:r>
-        <w:t xml:space="preserve"> Started by building a pure CLI application to nail the fundamentals — parsing the synthetic data, handling timestamps, and building the basic execution loop.</w:t>
+        <w:t xml:space="preserve"> Started by building a pure CLI application to nail the fundamentals </w:t>
+      </w:r>
+      <w:r>
+        <w:t>-</w:t>
+      </w:r>
+      <w:r>
+        <w:t xml:space="preserve"> parsing the synthetic data, handling timestamps, and building the basic execution loop.</w:t>
       </w:r>
     </w:p>
     <w:p>
@@ -1206,6 +1376,7 @@
       <w:r>
         <w:t xml:space="preserve"> </w:t>
       </w:r>
+      <w:proofErr w:type="spellStart"/>
       <w:r>
         <w:rPr>
           <w:rFonts w:ascii="Consolas" w:eastAsia="Consolas" w:hAnsi="Consolas" w:cs="Consolas"/>
@@ -1214,10 +1385,27 @@
           <w:szCs w:val="20"/>
           <w:shd w:val="clear" w:color="auto" w:fill="F2F2F2"/>
         </w:rPr>
-        <w:t>biggy eval</w:t>
-      </w:r>
-      <w:r>
-        <w:t xml:space="preserve"> regression-tests the current shipped cases — it runs the engine blind, then grades the result against a hidden answer key</w:t>
+        <w:t>biggy</w:t>
+      </w:r>
+      <w:proofErr w:type="spellEnd"/>
+      <w:r>
+        <w:rPr>
+          <w:rFonts w:ascii="Consolas" w:eastAsia="Consolas" w:hAnsi="Consolas" w:cs="Consolas"/>
+          <w:color w:val="C7254E"/>
+          <w:sz w:val="20"/>
+          <w:szCs w:val="20"/>
+          <w:shd w:val="clear" w:color="auto" w:fill="F2F2F2"/>
+        </w:rPr>
+        <w:t xml:space="preserve"> eval</w:t>
+      </w:r>
+      <w:r>
+        <w:t xml:space="preserve"> regression-tests the current shipped cases </w:t>
+      </w:r>
+      <w:r>
+        <w:t>-</w:t>
+      </w:r>
+      <w:r>
+        <w:t xml:space="preserve"> it runs the engine blind, then grades the result against a hidden answer key</w:t>
       </w:r>
       <w:r>
         <w:t>.</w:t>
@@ -1272,10 +1460,7 @@
         <w:pStyle w:val="Heading1"/>
       </w:pPr>
       <w:r>
-        <w:t>Trade-offs</w:t>
-      </w:r>
-      <w:r>
-        <w:t xml:space="preserve"> I made</w:t>
+        <w:t>Trade-offs I made</w:t>
       </w:r>
     </w:p>
     <w:tbl>
@@ -1302,12 +1487,6 @@
         <w:gridCol w:w="2470"/>
       </w:tblGrid>
       <w:tr>
-        <w:tblPrEx>
-          <w:tblCellMar>
-            <w:top w:w="0" w:type="dxa"/>
-            <w:bottom w:w="0" w:type="dxa"/>
-          </w:tblCellMar>
-        </w:tblPrEx>
         <w:trPr>
           <w:tblHeader/>
         </w:trPr>
@@ -1433,12 +1612,6 @@
         </w:tc>
       </w:tr>
       <w:tr>
-        <w:tblPrEx>
-          <w:tblCellMar>
-            <w:top w:w="0" w:type="dxa"/>
-            <w:bottom w:w="0" w:type="dxa"/>
-          </w:tblCellMar>
-        </w:tblPrEx>
         <w:tc>
           <w:tcPr>
             <w:tcW w:w="1560" w:type="dxa"/>
@@ -1545,12 +1718,6 @@
         </w:tc>
       </w:tr>
       <w:tr>
-        <w:tblPrEx>
-          <w:tblCellMar>
-            <w:top w:w="0" w:type="dxa"/>
-            <w:bottom w:w="0" w:type="dxa"/>
-          </w:tblCellMar>
-        </w:tblPrEx>
         <w:tc>
           <w:tcPr>
             <w:tcW w:w="1560" w:type="dxa"/>
@@ -1655,18 +1822,28 @@
                 <w:sz w:val="20"/>
                 <w:szCs w:val="20"/>
               </w:rPr>
-              <w:t>No independent skeptic agent yet</w:t>
+              <w:t xml:space="preserve">No independent </w:t>
+            </w:r>
+            <w:proofErr w:type="spellStart"/>
+            <w:r>
+              <w:rPr>
+                <w:sz w:val="20"/>
+                <w:szCs w:val="20"/>
+              </w:rPr>
+              <w:t>skeptic</w:t>
+            </w:r>
+            <w:proofErr w:type="spellEnd"/>
+            <w:r>
+              <w:rPr>
+                <w:sz w:val="20"/>
+                <w:szCs w:val="20"/>
+              </w:rPr>
+              <w:t xml:space="preserve"> agent yet</w:t>
             </w:r>
           </w:p>
         </w:tc>
       </w:tr>
       <w:tr>
-        <w:tblPrEx>
-          <w:tblCellMar>
-            <w:top w:w="0" w:type="dxa"/>
-            <w:bottom w:w="0" w:type="dxa"/>
-          </w:tblCellMar>
-        </w:tblPrEx>
         <w:tc>
           <w:tcPr>
             <w:tcW w:w="1560" w:type="dxa"/>
@@ -1795,12 +1972,6 @@
         </w:tc>
       </w:tr>
       <w:tr>
-        <w:tblPrEx>
-          <w:tblCellMar>
-            <w:top w:w="0" w:type="dxa"/>
-            <w:bottom w:w="0" w:type="dxa"/>
-          </w:tblCellMar>
-        </w:tblPrEx>
         <w:tc>
           <w:tcPr>
             <w:tcW w:w="1560" w:type="dxa"/>
@@ -1907,12 +2078,6 @@
         </w:tc>
       </w:tr>
       <w:tr>
-        <w:tblPrEx>
-          <w:tblCellMar>
-            <w:top w:w="0" w:type="dxa"/>
-            <w:bottom w:w="0" w:type="dxa"/>
-          </w:tblCellMar>
-        </w:tblPrEx>
         <w:tc>
           <w:tcPr>
             <w:tcW w:w="1560" w:type="dxa"/>
@@ -2013,18 +2178,28 @@
                 <w:sz w:val="20"/>
                 <w:szCs w:val="20"/>
               </w:rPr>
-              <w:t>May exclude older context unless modeled as standing knowledge</w:t>
+              <w:t xml:space="preserve">May exclude older context unless </w:t>
+            </w:r>
+            <w:proofErr w:type="spellStart"/>
+            <w:r>
+              <w:rPr>
+                <w:sz w:val="20"/>
+                <w:szCs w:val="20"/>
+              </w:rPr>
+              <w:t>modeled</w:t>
+            </w:r>
+            <w:proofErr w:type="spellEnd"/>
+            <w:r>
+              <w:rPr>
+                <w:sz w:val="20"/>
+                <w:szCs w:val="20"/>
+              </w:rPr>
+              <w:t xml:space="preserve"> as standing knowledge</w:t>
             </w:r>
           </w:p>
         </w:tc>
       </w:tr>
       <w:tr>
-        <w:tblPrEx>
-          <w:tblCellMar>
-            <w:top w:w="0" w:type="dxa"/>
-            <w:bottom w:w="0" w:type="dxa"/>
-          </w:tblCellMar>
-        </w:tblPrEx>
         <w:tc>
           <w:tcPr>
             <w:tcW w:w="1560" w:type="dxa"/>
@@ -2175,23 +2350,92 @@
           <w:numId w:val="7"/>
         </w:numPr>
         <w:spacing w:after="120"/>
+      </w:pPr>
+      <w:r>
         <w:rPr>
           <w:b/>
           <w:bCs/>
         </w:rPr>
-      </w:pPr>
+        <w:t xml:space="preserve">Blend reasoning </w:t>
+      </w:r>
       <w:r>
         <w:rPr>
           <w:b/>
           <w:bCs/>
         </w:rPr>
-        <w:t xml:space="preserve">Attempt different model approaches – </w:t>
-      </w:r>
-      <w:r>
-        <w:t xml:space="preserve">The current hypothesis driven workflow does yield promising results, but one of the downfalls is it potentially misses symptoms / knock on causes which are present in the log files. A knowledge graph / summary of summaries may be better. E.g. we seed the hypothesis along with </w:t>
-      </w:r>
-      <w:r>
-        <w:t>more informed data.</w:t>
+        <w:t xml:space="preserve">approaches – </w:t>
+      </w:r>
+      <w:r>
+        <w:t>The current hypothesis driven workflow</w:t>
+      </w:r>
+      <w:r>
+        <w:t xml:space="preserve"> uses </w:t>
+      </w:r>
+      <w:r>
+        <w:t>abductive reasoning</w:t>
+      </w:r>
+      <w:r>
+        <w:t>, which</w:t>
+      </w:r>
+      <w:r>
+        <w:t xml:space="preserve"> does yield promising results, but one of the downfalls is it potentially misses symptoms / knock on causes which are </w:t>
+      </w:r>
+      <w:r>
+        <w:t>present in the logs but not represented in the initial hypothesis set</w:t>
+      </w:r>
+      <w:r>
+        <w:t>.</w:t>
+      </w:r>
+    </w:p>
+    <w:p>
+      <w:pPr>
+        <w:pStyle w:val="ListParagraph"/>
+        <w:spacing w:after="120"/>
+        <w:ind w:left="720"/>
+      </w:pPr>
+      <w:r>
+        <w:t>It would be interest</w:t>
+      </w:r>
+      <w:r>
+        <w:t>ing</w:t>
+      </w:r>
+      <w:r>
+        <w:t xml:space="preserve"> to try other reasoning approaches</w:t>
+      </w:r>
+      <w:r>
+        <w:t xml:space="preserve">. </w:t>
+      </w:r>
+      <w:r>
+        <w:t>An </w:t>
+      </w:r>
+      <w:r>
+        <w:rPr>
+          <w:i/>
+          <w:iCs/>
+        </w:rPr>
+        <w:t>inductive</w:t>
+      </w:r>
+      <w:r>
+        <w:t> pass (summarize the whole window to surface anomalies bottom-up) and </w:t>
+      </w:r>
+      <w:r>
+        <w:rPr>
+          <w:i/>
+          <w:iCs/>
+        </w:rPr>
+        <w:t>deductive</w:t>
+      </w:r>
+      <w:r>
+        <w:t xml:space="preserve"> checks (apply known runbook rules) would complement it </w:t>
+      </w:r>
+      <w:r>
+        <w:t>-</w:t>
+      </w:r>
+      <w:r>
+        <w:t xml:space="preserve"> I suspect a blended approach is best.</w:t>
+      </w:r>
+      <w:r>
+        <w:t xml:space="preserve"> </w:t>
       </w:r>
     </w:p>
     <w:p>
@@ -2256,21 +2500,8 @@
           <w:b/>
           <w:bCs/>
         </w:rPr>
-        <w:t>E</w:t>
-      </w:r>
-      <w:r>
-        <w:rPr>
-          <w:b/>
-          <w:bCs/>
-        </w:rPr>
-        <w:t>vidence handling</w:t>
-      </w:r>
-      <w:r>
-        <w:rPr>
-          <w:b/>
-          <w:bCs/>
-        </w:rPr>
-        <w:t xml:space="preserve"> -</w:t>
+        <w:lastRenderedPageBreak/>
+        <w:t>Evidence handling -</w:t>
       </w:r>
       <w:r>
         <w:t xml:space="preserve"> </w:t>
@@ -2390,11 +2621,7 @@
         <w:t xml:space="preserve">we </w:t>
       </w:r>
       <w:r>
-        <w:t xml:space="preserve">quickly fill up the </w:t>
-      </w:r>
-      <w:r>
-        <w:lastRenderedPageBreak/>
-        <w:t xml:space="preserve">available context. A better approach may be to </w:t>
+        <w:t xml:space="preserve">quickly fill up the available context. A better approach may be to </w:t>
       </w:r>
       <w:r>
         <w:t>summarise findings on the fly, spin up sub-agents where appropriate in the investigate loop.</w:t>
@@ -2459,6 +2686,119 @@
 <file path=word/numbering.xml><?xml version="1.0" encoding="utf-8"?>
 <w:numbering xmlns:wpc="http://schemas.microsoft.com/office/word/2010/wordprocessingCanvas" xmlns:cx="http://schemas.microsoft.com/office/drawing/2014/chartex" xmlns:cx1="http://schemas.microsoft.com/office/drawing/2015/9/8/chartex" xmlns:cx2="http://schemas.microsoft.com/office/drawing/2015/10/21/chartex" xmlns:cx3="http://schemas.microsoft.com/office/drawing/2016/5/9/chartex" xmlns:cx4="http://schemas.microsoft.com/office/drawing/2016/5/10/chartex" xmlns:cx5="http://schemas.microsoft.com/office/drawing/2016/5/11/chartex" xmlns:cx6="http://schemas.microsoft.com/office/drawing/2016/5/12/chartex" xmlns:cx7="http://schemas.microsoft.com/office/drawing/2016/5/13/chartex" xmlns:cx8="http://schemas.microsoft.com/office/drawing/2016/5/14/chartex" xmlns:mc="http://schemas.openxmlformats.org/markup-compatibility/2006" xmlns:aink="http://schemas.microsoft.com/office/drawing/2016/ink" xmlns:am3d="http://schemas.microsoft.com/office/drawing/2017/model3d" xmlns:o="urn:schemas-microsoft-com:office:office" xmlns:oel="http://schemas.microsoft.com/office/2019/extlst" xmlns:r="http://schemas.openxmlformats.org/officeDocument/2006/relationships" xmlns:m="http://schemas.openxmlformats.org/officeDocument/2006/math" xmlns:v="urn:schemas-microsoft-com:vml" xmlns:wp14="http://schemas.microsoft.com/office/word/2010/wordprocessingDrawing" xmlns:wp="http://schemas.openxmlformats.org/drawingml/2006/wordprocessingDrawing" xmlns:w10="urn:schemas-microsoft-com:office:word" xmlns:w="http://schemas.openxmlformats.org/wordprocessingml/2006/main" xmlns:w14="http://schemas.microsoft.com/office/word/2010/wordml" xmlns:w15="http://schemas.microsoft.com/office/word/2012/wordml" xmlns:w16cex="http://schemas.microsoft.com/office/word/2018/wordml/cex" xmlns:w16cid="http://schemas.microsoft.com/office/word/2016/wordml/cid" xmlns:w16="http://schemas.microsoft.com/office/word/2018/wordml" xmlns:w16du="http://schemas.microsoft.com/office/word/2023/wordml/word16du" xmlns:w16sdtdh="http://schemas.microsoft.com/office/word/2020/wordml/sdtdatahash" xmlns:w16sdtfl="http://schemas.microsoft.com/office/word/2024/wordml/sdtformatlock" xmlns:w16se="http://schemas.microsoft.com/office/word/2015/wordml/symex" xmlns:wpg="http://schemas.microsoft.com/office/word/2010/wordprocessingGroup" xmlns:wpi="http://schemas.microsoft.com/office/word/2010/wordprocessingInk" xmlns:wne="http://schemas.microsoft.com/office/word/2006/wordml" xmlns:wps="http://schemas.microsoft.com/office/word/2010/wordprocessingShape" mc:Ignorable="w14 w15 w16se w16cid w16 w16cex w16sdtdh w16sdtfl w16du wp14">
   <w:abstractNum w:abstractNumId="0" w15:restartNumberingAfterBreak="0">
+    <w:nsid w:val="087D43B7"/>
+    <w:multiLevelType w:val="multilevel"/>
+    <w:tmpl w:val="F07C50DE"/>
+    <w:lvl w:ilvl="0">
+      <w:start w:val="1"/>
+      <w:numFmt w:val="decimal"/>
+      <w:lvlText w:val="%1."/>
+      <w:lvlJc w:val="left"/>
+      <w:pPr>
+        <w:tabs>
+          <w:tab w:val="num" w:pos="720"/>
+        </w:tabs>
+        <w:ind w:left="720" w:hanging="720"/>
+      </w:pPr>
+    </w:lvl>
+    <w:lvl w:ilvl="1">
+      <w:start w:val="1"/>
+      <w:numFmt w:val="decimal"/>
+      <w:lvlText w:val="%2."/>
+      <w:lvlJc w:val="left"/>
+      <w:pPr>
+        <w:tabs>
+          <w:tab w:val="num" w:pos="1440"/>
+        </w:tabs>
+        <w:ind w:left="1440" w:hanging="720"/>
+      </w:pPr>
+    </w:lvl>
+    <w:lvl w:ilvl="2">
+      <w:start w:val="1"/>
+      <w:numFmt w:val="decimal"/>
+      <w:lvlText w:val="%3."/>
+      <w:lvlJc w:val="left"/>
+      <w:pPr>
+        <w:tabs>
+          <w:tab w:val="num" w:pos="2160"/>
+        </w:tabs>
+        <w:ind w:left="2160" w:hanging="720"/>
+      </w:pPr>
+    </w:lvl>
+    <w:lvl w:ilvl="3">
+      <w:start w:val="1"/>
+      <w:numFmt w:val="decimal"/>
+      <w:lvlText w:val="%4."/>
+      <w:lvlJc w:val="left"/>
+      <w:pPr>
+        <w:tabs>
+          <w:tab w:val="num" w:pos="2880"/>
+        </w:tabs>
+        <w:ind w:left="2880" w:hanging="720"/>
+      </w:pPr>
+    </w:lvl>
+    <w:lvl w:ilvl="4">
+      <w:start w:val="1"/>
+      <w:numFmt w:val="decimal"/>
+      <w:lvlText w:val="%5."/>
+      <w:lvlJc w:val="left"/>
+      <w:pPr>
+        <w:tabs>
+          <w:tab w:val="num" w:pos="3600"/>
+        </w:tabs>
+        <w:ind w:left="3600" w:hanging="720"/>
+      </w:pPr>
+    </w:lvl>
+    <w:lvl w:ilvl="5">
+      <w:start w:val="1"/>
+      <w:numFmt w:val="decimal"/>
+      <w:lvlText w:val="%6."/>
+      <w:lvlJc w:val="left"/>
+      <w:pPr>
+        <w:tabs>
+          <w:tab w:val="num" w:pos="4320"/>
+        </w:tabs>
+        <w:ind w:left="4320" w:hanging="720"/>
+      </w:pPr>
+    </w:lvl>
+    <w:lvl w:ilvl="6">
+      <w:start w:val="1"/>
+      <w:numFmt w:val="decimal"/>
+      <w:lvlText w:val="%7."/>
+      <w:lvlJc w:val="left"/>
+      <w:pPr>
+        <w:tabs>
+          <w:tab w:val="num" w:pos="5040"/>
+        </w:tabs>
+        <w:ind w:left="5040" w:hanging="720"/>
+      </w:pPr>
+    </w:lvl>
+    <w:lvl w:ilvl="7">
+      <w:start w:val="1"/>
+      <w:numFmt w:val="decimal"/>
+      <w:lvlText w:val="%8."/>
+      <w:lvlJc w:val="left"/>
+      <w:pPr>
+        <w:tabs>
+          <w:tab w:val="num" w:pos="5760"/>
+        </w:tabs>
+        <w:ind w:left="5760" w:hanging="720"/>
+      </w:pPr>
+    </w:lvl>
+    <w:lvl w:ilvl="8">
+      <w:start w:val="1"/>
+      <w:numFmt w:val="decimal"/>
+      <w:lvlText w:val="%9."/>
+      <w:lvlJc w:val="left"/>
+      <w:pPr>
+        <w:tabs>
+          <w:tab w:val="num" w:pos="6480"/>
+        </w:tabs>
+        <w:ind w:left="6480" w:hanging="720"/>
+      </w:pPr>
+    </w:lvl>
+  </w:abstractNum>
+  <w:abstractNum w:abstractNumId="1" w15:restartNumberingAfterBreak="0">
     <w:nsid w:val="15616AC5"/>
     <w:multiLevelType w:val="hybridMultilevel"/>
     <w:tmpl w:val="414ECE56"/>
@@ -2515,7 +2855,7 @@
       <w:lvlJc w:val="left"/>
     </w:lvl>
   </w:abstractNum>
-  <w:abstractNum w:abstractNumId="1" w15:restartNumberingAfterBreak="0">
+  <w:abstractNum w:abstractNumId="2" w15:restartNumberingAfterBreak="0">
     <w:nsid w:val="1FDA1A35"/>
     <w:multiLevelType w:val="hybridMultilevel"/>
     <w:tmpl w:val="5122DD30"/>
@@ -2585,7 +2925,7 @@
       <w:lvlJc w:val="left"/>
     </w:lvl>
   </w:abstractNum>
-  <w:abstractNum w:abstractNumId="2" w15:restartNumberingAfterBreak="0">
+  <w:abstractNum w:abstractNumId="3" w15:restartNumberingAfterBreak="0">
     <w:nsid w:val="33AE6378"/>
     <w:multiLevelType w:val="hybridMultilevel"/>
     <w:tmpl w:val="579A4B44"/>
@@ -2671,7 +3011,7 @@
       </w:pPr>
     </w:lvl>
   </w:abstractNum>
-  <w:abstractNum w:abstractNumId="3" w15:restartNumberingAfterBreak="0">
+  <w:abstractNum w:abstractNumId="4" w15:restartNumberingAfterBreak="0">
     <w:nsid w:val="49480B38"/>
     <w:multiLevelType w:val="hybridMultilevel"/>
     <w:tmpl w:val="928682A0"/>
@@ -2729,30 +3069,33 @@
     </w:lvl>
   </w:abstractNum>
   <w:num w:numId="1" w16cid:durableId="803158319">
+    <w:abstractNumId w:val="3"/>
+    <w:lvlOverride w:ilvl="0">
+      <w:startOverride w:val="1"/>
+    </w:lvlOverride>
+  </w:num>
+  <w:num w:numId="2" w16cid:durableId="711422460">
+    <w:abstractNumId w:val="1"/>
+    <w:lvlOverride w:ilvl="0">
+      <w:startOverride w:val="1"/>
+    </w:lvlOverride>
+  </w:num>
+  <w:num w:numId="3" w16cid:durableId="627468686">
+    <w:abstractNumId w:val="4"/>
+  </w:num>
+  <w:num w:numId="4" w16cid:durableId="961690229">
     <w:abstractNumId w:val="2"/>
     <w:lvlOverride w:ilvl="0">
       <w:startOverride w:val="1"/>
     </w:lvlOverride>
   </w:num>
-  <w:num w:numId="2" w16cid:durableId="711422460">
-    <w:abstractNumId w:val="0"/>
-    <w:lvlOverride w:ilvl="0">
-      <w:startOverride w:val="1"/>
-    </w:lvlOverride>
-  </w:num>
-  <w:num w:numId="3" w16cid:durableId="627468686">
-    <w:abstractNumId w:val="3"/>
-  </w:num>
-  <w:num w:numId="4" w16cid:durableId="961690229">
-    <w:abstractNumId w:val="1"/>
-    <w:lvlOverride w:ilvl="0">
-      <w:startOverride w:val="1"/>
-    </w:lvlOverride>
-  </w:num>
   <w:num w:numId="5" w16cid:durableId="821385775">
-    <w:abstractNumId w:val="3"/>
+    <w:abstractNumId w:val="4"/>
   </w:num>
   <w:num w:numId="6" w16cid:durableId="1583177164">
+    <w:abstractNumId w:val="1"/>
+  </w:num>
+  <w:num w:numId="7" w16cid:durableId="1442799007">
     <w:abstractNumId w:val="0"/>
   </w:num>
 </w:numbering>
@@ -3245,7 +3588,6 @@
   <w:style w:type="character" w:default="1" w:styleId="DefaultParagraphFont">
     <w:name w:val="Default Paragraph Font"/>
     <w:uiPriority w:val="1"/>
-    <w:semiHidden/>
     <w:unhideWhenUsed/>
   </w:style>
   <w:style w:type="table" w:default="1" w:styleId="TableNormal">

</xml_diff>